<commit_message>
feat(teacher): add Lesson feature with TV slide presentation mode, question bank integration, and teaching tools
</commit_message>
<xml_diff>
--- a/teacher/data/template_word_exam.docx
+++ b/teacher/data/template_word_exam.docx
@@ -4,329 +4,621 @@
   <w:body>
     <w:tbl>
       <w:tblPr>
-        <w:tblStyle w:val="TableGrid"/>
-        <w:tblW w:w="10060" w:type="dxa"/>
-        <w:jc w:val="center"/>
+        <w:tblpPr w:leftFromText="180" w:rightFromText="180" w:vertAnchor="text" w:horzAnchor="margin" w:tblpY="4"/>
+        <w:tblW w:w="9918" w:type="dxa"/>
+        <w:tblBorders>
+          <w:top w:val="single" w:sz="4" w:space="0" w:color="auto"/>
+          <w:left w:val="single" w:sz="4" w:space="0" w:color="auto"/>
+          <w:bottom w:val="single" w:sz="4" w:space="0" w:color="auto"/>
+          <w:right w:val="single" w:sz="4" w:space="0" w:color="auto"/>
+          <w:insideH w:val="single" w:sz="4" w:space="0" w:color="auto"/>
+          <w:insideV w:val="single" w:sz="4" w:space="0" w:color="auto"/>
+        </w:tblBorders>
         <w:tblLook w:val="04A0" w:firstRow="1" w:lastRow="0" w:firstColumn="1" w:lastColumn="0" w:noHBand="0" w:noVBand="1"/>
       </w:tblPr>
       <w:tblGrid>
-        <w:gridCol w:w="4675"/>
-        <w:gridCol w:w="5385"/>
+        <w:gridCol w:w="4248"/>
+        <w:gridCol w:w="5670"/>
       </w:tblGrid>
       <w:tr>
-        <w:trPr>
-          <w:jc w:val="center"/>
-        </w:trPr>
         <w:tc>
           <w:tcPr>
-            <w:tcW w:w="4675" w:type="dxa"/>
+            <w:tcW w:w="4248" w:type="dxa"/>
+            <w:tcBorders>
+              <w:top w:val="dotted" w:sz="4" w:space="0" w:color="auto"/>
+              <w:left w:val="dotted" w:sz="4" w:space="0" w:color="auto"/>
+              <w:bottom w:val="single" w:sz="4" w:space="0" w:color="auto"/>
+              <w:right w:val="dotted" w:sz="4" w:space="0" w:color="auto"/>
+            </w:tcBorders>
           </w:tcPr>
           <w:p>
             <w:pPr>
+              <w:pStyle w:val="Normal0"/>
+              <w:mirrorIndents/>
               <w:jc w:val="center"/>
               <w:rPr>
-                <w:rFonts w:ascii="Times New Roman" w:hAnsi="Times New Roman" w:cs="Times New Roman"/>
-                <w:b/>
-                <w:bCs/>
-                <w:sz w:val="26"/>
-                <w:szCs w:val="26"/>
+                <w:sz w:val="26"/>
+                <w:szCs w:val="26"/>
+                <w:lang w:val="it-IT"/>
               </w:rPr>
             </w:pPr>
             <w:r>
               <w:rPr>
-                <w:rFonts w:ascii="Times New Roman" w:hAnsi="Times New Roman" w:cs="Times New Roman"/>
-                <w:b/>
-                <w:bCs/>
-                <w:sz w:val="26"/>
-                <w:szCs w:val="26"/>
+                <w:sz w:val="26"/>
+                <w:szCs w:val="26"/>
+                <w:lang w:val="it-IT"/>
               </w:rPr>
               <w:t>UBND PHƯỜNG VĨNH CHÂU</w:t>
             </w:r>
           </w:p>
           <w:p>
             <w:pPr>
+              <w:pStyle w:val="Normal0"/>
+              <w:mirrorIndents/>
               <w:jc w:val="center"/>
               <w:rPr>
-                <w:rFonts w:ascii="Times New Roman" w:hAnsi="Times New Roman" w:cs="Times New Roman"/>
                 <w:b/>
-                <w:bCs/>
-                <w:sz w:val="26"/>
-                <w:szCs w:val="26"/>
+                <w:sz w:val="26"/>
+                <w:szCs w:val="26"/>
+                <w:lang w:val="it-IT"/>
               </w:rPr>
             </w:pPr>
             <w:r>
               <w:rPr>
-                <w:rFonts w:ascii="Times New Roman" w:hAnsi="Times New Roman" w:cs="Times New Roman"/>
                 <w:b/>
-                <w:bCs/>
-                <w:sz w:val="26"/>
-                <w:szCs w:val="26"/>
+                <w:sz w:val="26"/>
+                <w:szCs w:val="26"/>
+                <w:lang w:val="it-IT"/>
               </w:rPr>
               <w:t>TRƯỜNG THCS CHÂU VĂN ĐƠ</w:t>
             </w:r>
           </w:p>
           <w:p>
             <w:pPr>
+              <w:pStyle w:val="Normal0"/>
+              <w:mirrorIndents/>
               <w:jc w:val="center"/>
               <w:rPr>
-                <w:rFonts w:ascii="Times New Roman" w:hAnsi="Times New Roman" w:cs="Times New Roman"/>
                 <w:b/>
-                <w:bCs/>
-                <w:sz w:val="26"/>
-                <w:szCs w:val="26"/>
+                <w:sz w:val="26"/>
+                <w:szCs w:val="26"/>
+                <w:lang w:val="it-IT"/>
               </w:rPr>
             </w:pPr>
+            <w:r>
+              <w:rPr>
+                <w:noProof/>
+              </w:rPr>
+              <mc:AlternateContent>
+                <mc:Choice Requires="wps">
+                  <w:drawing>
+                    <wp:anchor distT="4294967291" distB="4294967291" distL="114300" distR="114300" simplePos="0" relativeHeight="251659264" behindDoc="0" locked="0" layoutInCell="1" allowOverlap="1" wp14:anchorId="43C76642" wp14:editId="53AAC885">
+                      <wp:simplePos x="0" y="0"/>
+                      <wp:positionH relativeFrom="column">
+                        <wp:posOffset>618490</wp:posOffset>
+                      </wp:positionH>
+                      <wp:positionV relativeFrom="paragraph">
+                        <wp:posOffset>41274</wp:posOffset>
+                      </wp:positionV>
+                      <wp:extent cx="1286510" cy="0"/>
+                      <wp:effectExtent l="0" t="0" r="0" b="0"/>
+                      <wp:wrapNone/>
+                      <wp:docPr id="1368749995" name="Straight Connector 1368749995"/>
+                      <wp:cNvGraphicFramePr>
+                        <a:graphicFrameLocks xmlns:a="http://schemas.openxmlformats.org/drawingml/2006/main"/>
+                      </wp:cNvGraphicFramePr>
+                      <a:graphic xmlns:a="http://schemas.openxmlformats.org/drawingml/2006/main">
+                        <a:graphicData uri="http://schemas.microsoft.com/office/word/2010/wordprocessingShape">
+                          <wps:wsp>
+                            <wps:cNvCnPr>
+                              <a:cxnSpLocks noChangeShapeType="1"/>
+                            </wps:cNvCnPr>
+                            <wps:spPr bwMode="auto">
+                              <a:xfrm>
+                                <a:off x="0" y="0"/>
+                                <a:ext cx="1286510" cy="0"/>
+                              </a:xfrm>
+                              <a:prstGeom prst="line">
+                                <a:avLst/>
+                              </a:prstGeom>
+                              <a:noFill/>
+                              <a:ln w="9525">
+                                <a:solidFill>
+                                  <a:srgbClr val="000000"/>
+                                </a:solidFill>
+                                <a:round/>
+                                <a:headEnd/>
+                                <a:tailEnd/>
+                              </a:ln>
+                            </wps:spPr>
+                            <wps:bodyPr/>
+                          </wps:wsp>
+                        </a:graphicData>
+                      </a:graphic>
+                      <wp14:sizeRelH relativeFrom="page">
+                        <wp14:pctWidth>0</wp14:pctWidth>
+                      </wp14:sizeRelH>
+                      <wp14:sizeRelV relativeFrom="page">
+                        <wp14:pctHeight>0</wp14:pctHeight>
+                      </wp14:sizeRelV>
+                    </wp:anchor>
+                  </w:drawing>
+                </mc:Choice>
+                <mc:Fallback>
+                  <w:pict>
+                    <v:line w14:anchorId="4F0E4AF7" id="Straight Connector 1368749995" o:spid="_x0000_s1026" style="position:absolute;z-index:251659264;visibility:visible;mso-wrap-style:square;mso-width-percent:0;mso-height-percent:0;mso-wrap-distance-left:9pt;mso-wrap-distance-top:-1e-4mm;mso-wrap-distance-right:9pt;mso-wrap-distance-bottom:-1e-4mm;mso-position-horizontal:absolute;mso-position-horizontal-relative:text;mso-position-vertical:absolute;mso-position-vertical-relative:text;mso-width-percent:0;mso-height-percent:0;mso-width-relative:page;mso-height-relative:page" from="48.7pt,3.25pt" to="150pt,3.25pt" o:gfxdata="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"/>
+                  </w:pict>
+                </mc:Fallback>
+              </mc:AlternateContent>
+            </w:r>
           </w:p>
           <w:p>
             <w:pPr>
+              <w:pStyle w:val="Normal0"/>
+              <w:mirrorIndents/>
               <w:jc w:val="center"/>
               <w:rPr>
-                <w:rFonts w:ascii="Times New Roman" w:hAnsi="Times New Roman" w:cs="Times New Roman"/>
                 <w:b/>
-                <w:bCs/>
-                <w:i/>
-                <w:iCs/>
-                <w:sz w:val="26"/>
-                <w:szCs w:val="26"/>
+                <w:sz w:val="26"/>
+                <w:szCs w:val="26"/>
+                <w:lang w:val="it-IT"/>
               </w:rPr>
             </w:pPr>
             <w:r>
               <w:rPr>
-                <w:rFonts w:ascii="Times New Roman" w:hAnsi="Times New Roman" w:cs="Times New Roman"/>
-                <w:b/>
-                <w:bCs/>
+                <w:sz w:val="26"/>
+                <w:szCs w:val="26"/>
+                <w:lang w:val="it-IT"/>
+              </w:rPr>
+              <w:t>(</w:t>
+            </w:r>
+            <w:r>
+              <w:rPr>
                 <w:i/>
-                <w:iCs/>
-                <w:sz w:val="26"/>
-                <w:szCs w:val="26"/>
-              </w:rPr>
-              <w:t>(Đề thi có 02 trang)</w:t>
+                <w:sz w:val="26"/>
+                <w:szCs w:val="26"/>
+                <w:lang w:val="it-IT"/>
+              </w:rPr>
+              <w:t xml:space="preserve">Đề thi có </w:t>
+            </w:r>
+            <w:r>
+              <w:rPr>
+                <w:i/>
+                <w:sz w:val="26"/>
+                <w:szCs w:val="26"/>
+                <w:lang w:val="it-IT"/>
+              </w:rPr>
+              <w:t>${sotrang}</w:t>
+            </w:r>
+            <w:r>
+              <w:rPr>
+                <w:i/>
+                <w:sz w:val="26"/>
+                <w:szCs w:val="26"/>
+                <w:lang w:val="it-IT"/>
+              </w:rPr>
+              <w:t xml:space="preserve"> trang</w:t>
+            </w:r>
+            <w:r>
+              <w:rPr>
+                <w:sz w:val="26"/>
+                <w:szCs w:val="26"/>
+                <w:lang w:val="it-IT"/>
+              </w:rPr>
+              <w:t>)</w:t>
             </w:r>
           </w:p>
         </w:tc>
         <w:tc>
           <w:tcPr>
-            <w:tcW w:w="5385" w:type="dxa"/>
+            <w:tcW w:w="5670" w:type="dxa"/>
+            <w:tcBorders>
+              <w:top w:val="dotted" w:sz="4" w:space="0" w:color="auto"/>
+              <w:left w:val="dotted" w:sz="4" w:space="0" w:color="auto"/>
+              <w:bottom w:val="single" w:sz="4" w:space="0" w:color="auto"/>
+              <w:right w:val="dotted" w:sz="4" w:space="0" w:color="auto"/>
+            </w:tcBorders>
+            <w:hideMark/>
           </w:tcPr>
           <w:p>
             <w:pPr>
+              <w:pStyle w:val="Normal0"/>
+              <w:mirrorIndents/>
               <w:jc w:val="center"/>
               <w:rPr>
-                <w:rFonts w:ascii="Times New Roman" w:hAnsi="Times New Roman" w:cs="Times New Roman"/>
                 <w:b/>
-                <w:bCs/>
-                <w:sz w:val="26"/>
-                <w:szCs w:val="26"/>
-                <w:lang w:val="sv-SE"/>
+                <w:sz w:val="26"/>
+                <w:szCs w:val="26"/>
+                <w:lang w:val="it-IT"/>
               </w:rPr>
             </w:pPr>
             <w:r>
-              <w:t>${test_name}</w:t>
-            </w:r>
-            <w:r>
-              <w:t xml:space="preserve"> </w:t>
-            </w:r>
-            <w:r>
-              <w:rPr>
-                <w:rFonts w:ascii="Times New Roman" w:hAnsi="Times New Roman" w:cs="Times New Roman"/>
+              <w:rPr>
                 <w:b/>
-                <w:bCs/>
-                <w:sz w:val="26"/>
-                <w:szCs w:val="26"/>
-                <w:lang w:val="sv-SE"/>
-              </w:rPr>
-              <w:t>NĂM HỌC 2025-2026</w:t>
+                <w:sz w:val="26"/>
+                <w:szCs w:val="26"/>
+                <w:lang w:val="it-IT"/>
+              </w:rPr>
+              <w:t>${testname} NĂM ${schoolyear}</w:t>
             </w:r>
           </w:p>
           <w:p>
             <w:pPr>
+              <w:pStyle w:val="Normal0"/>
+              <w:mirrorIndents/>
               <w:jc w:val="center"/>
               <w:rPr>
-                <w:rFonts w:ascii="Times New Roman" w:hAnsi="Times New Roman" w:cs="Times New Roman"/>
                 <w:b/>
-                <w:bCs/>
-                <w:sz w:val="26"/>
-                <w:szCs w:val="26"/>
-                <w:lang w:val="sv-SE"/>
+                <w:sz w:val="26"/>
+                <w:szCs w:val="26"/>
+                <w:lang w:val="it-IT"/>
               </w:rPr>
             </w:pPr>
             <w:r>
               <w:rPr>
-                <w:rFonts w:ascii="Times New Roman" w:hAnsi="Times New Roman" w:cs="Times New Roman"/>
                 <w:b/>
-                <w:bCs/>
-                <w:sz w:val="26"/>
-                <w:szCs w:val="26"/>
-                <w:lang w:val="sv-SE"/>
-              </w:rPr>
-              <w:t>MÔN: &lt;môn học&gt; - &lt;Khối&gt;</w:t>
+                <w:sz w:val="26"/>
+                <w:szCs w:val="26"/>
+                <w:lang w:val="it-IT"/>
+              </w:rPr>
+              <w:t xml:space="preserve">MÔN: </w:t>
+            </w:r>
+            <w:r>
+              <w:rPr>
+                <w:b/>
+                <w:sz w:val="26"/>
+                <w:szCs w:val="26"/>
+                <w:lang w:val="it-IT"/>
+              </w:rPr>
+              <w:t>${monhoc}</w:t>
+            </w:r>
+            <w:r>
+              <w:rPr>
+                <w:b/>
+                <w:sz w:val="26"/>
+                <w:szCs w:val="26"/>
+                <w:lang w:val="it-IT"/>
+              </w:rPr>
+              <w:t xml:space="preserve"> – </w:t>
+            </w:r>
+            <w:r>
+              <w:rPr>
+                <w:b/>
+                <w:sz w:val="26"/>
+                <w:szCs w:val="26"/>
+                <w:lang w:val="it-IT"/>
+              </w:rPr>
+              <w:t>KHỐI ${grade}</w:t>
             </w:r>
           </w:p>
           <w:p>
             <w:pPr>
+              <w:pStyle w:val="Normal0"/>
+              <w:mirrorIndents/>
               <w:jc w:val="center"/>
               <w:rPr>
-                <w:rFonts w:ascii="Times New Roman" w:hAnsi="Times New Roman" w:cs="Times New Roman"/>
-                <w:b/>
-                <w:bCs/>
-                <w:sz w:val="26"/>
-                <w:szCs w:val="26"/>
+                <w:i/>
+                <w:sz w:val="26"/>
+                <w:szCs w:val="26"/>
+                <w:lang w:val="it-IT"/>
               </w:rPr>
             </w:pPr>
             <w:r>
               <w:rPr>
-                <w:rFonts w:ascii="Times New Roman" w:hAnsi="Times New Roman" w:cs="Times New Roman"/>
-                <w:b/>
-                <w:bCs/>
-                <w:sz w:val="26"/>
-                <w:szCs w:val="26"/>
+                <w:i/>
+                <w:sz w:val="26"/>
+                <w:szCs w:val="26"/>
+                <w:lang w:val="it-IT"/>
               </w:rPr>
               <w:t xml:space="preserve">Thời gian làm bài: </w:t>
             </w:r>
             <w:r>
-              <w:t>${time_limit}</w:t>
+              <w:rPr>
+                <w:i/>
+                <w:sz w:val="26"/>
+                <w:szCs w:val="26"/>
+                <w:lang w:val="it-IT"/>
+              </w:rPr>
+              <w:t>${time}</w:t>
             </w:r>
             <w:r>
               <w:rPr>
-                <w:rFonts w:ascii="Times New Roman" w:hAnsi="Times New Roman" w:cs="Times New Roman"/>
-                <w:b/>
-                <w:bCs/>
-                <w:sz w:val="26"/>
-                <w:szCs w:val="26"/>
+                <w:i/>
+                <w:sz w:val="26"/>
+                <w:szCs w:val="26"/>
+                <w:lang w:val="it-IT"/>
               </w:rPr>
               <w:t xml:space="preserve"> phút</w:t>
             </w:r>
           </w:p>
           <w:p>
             <w:pPr>
+              <w:pStyle w:val="Normal0"/>
+              <w:mirrorIndents/>
               <w:jc w:val="center"/>
               <w:rPr>
-                <w:rFonts w:ascii="Times New Roman" w:hAnsi="Times New Roman" w:cs="Times New Roman"/>
                 <w:b/>
-                <w:bCs/>
-                <w:sz w:val="26"/>
-                <w:szCs w:val="26"/>
-                <w:lang w:val="sv-SE"/>
+                <w:sz w:val="26"/>
+                <w:szCs w:val="26"/>
+                <w:lang w:val="it-IT"/>
               </w:rPr>
             </w:pPr>
             <w:r>
               <w:rPr>
-                <w:rFonts w:ascii="Times New Roman" w:hAnsi="Times New Roman" w:cs="Times New Roman"/>
-                <w:b/>
-                <w:bCs/>
                 <w:i/>
-                <w:iCs/>
-                <w:sz w:val="26"/>
-                <w:szCs w:val="26"/>
-                <w:lang w:val="sv-SE"/>
-              </w:rPr>
-              <w:t>(Không kể thời gian phát đề)</w:t>
+                <w:sz w:val="26"/>
+                <w:szCs w:val="26"/>
+                <w:lang w:val="it-IT"/>
+              </w:rPr>
+              <w:t>(không kể thời gian phát đề)</w:t>
             </w:r>
           </w:p>
         </w:tc>
       </w:tr>
       <w:tr>
         <w:trPr>
-          <w:jc w:val="center"/>
+          <w:trHeight w:val="1312"/>
         </w:trPr>
         <w:tc>
           <w:tcPr>
-            <w:tcW w:w="4675" w:type="dxa"/>
+            <w:tcW w:w="4248" w:type="dxa"/>
+            <w:tcBorders>
+              <w:top w:val="single" w:sz="4" w:space="0" w:color="auto"/>
+              <w:left w:val="single" w:sz="4" w:space="0" w:color="auto"/>
+              <w:bottom w:val="single" w:sz="4" w:space="0" w:color="auto"/>
+              <w:right w:val="single" w:sz="4" w:space="0" w:color="auto"/>
+            </w:tcBorders>
           </w:tcPr>
           <w:p>
             <w:pPr>
+              <w:pStyle w:val="Normal0"/>
+              <w:mirrorIndents/>
               <w:jc w:val="center"/>
               <w:rPr>
-                <w:rFonts w:ascii="Times New Roman" w:hAnsi="Times New Roman" w:cs="Times New Roman"/>
                 <w:b/>
-                <w:bCs/>
-                <w:lang w:val="sv-SE"/>
+                <w:sz w:val="26"/>
+                <w:szCs w:val="26"/>
+                <w:lang w:val="it-IT"/>
               </w:rPr>
             </w:pPr>
             <w:r>
               <w:rPr>
-                <w:rFonts w:ascii="Times New Roman" w:hAnsi="Times New Roman" w:cs="Times New Roman"/>
                 <w:b/>
-                <w:bCs/>
-                <w:lang w:val="sv-SE"/>
+                <w:sz w:val="26"/>
+                <w:szCs w:val="26"/>
+                <w:lang w:val="it-IT"/>
               </w:rPr>
               <w:t>Điểm</w:t>
             </w:r>
           </w:p>
           <w:p>
             <w:pPr>
+              <w:pStyle w:val="Normal0"/>
+              <w:mirrorIndents/>
               <w:jc w:val="center"/>
               <w:rPr>
-                <w:rFonts w:ascii="Times New Roman" w:hAnsi="Times New Roman" w:cs="Times New Roman"/>
                 <w:b/>
-                <w:bCs/>
-                <w:lang w:val="sv-SE"/>
+                <w:sz w:val="26"/>
+                <w:szCs w:val="26"/>
+                <w:lang w:val="it-IT"/>
               </w:rPr>
             </w:pPr>
             <w:r>
               <w:rPr>
-                <w:rFonts w:ascii="Times New Roman" w:hAnsi="Times New Roman" w:cs="Times New Roman"/>
                 <w:b/>
-                <w:bCs/>
-                <w:lang w:val="sv-SE"/>
+                <w:sz w:val="26"/>
+                <w:szCs w:val="26"/>
+                <w:lang w:val="it-IT"/>
               </w:rPr>
               <w:t>(Số và chữ)</w:t>
             </w:r>
           </w:p>
           <w:p>
             <w:pPr>
+              <w:pStyle w:val="Normal0"/>
+              <w:mirrorIndents/>
               <w:jc w:val="center"/>
               <w:rPr>
-                <w:rFonts w:ascii="Times New Roman" w:hAnsi="Times New Roman" w:cs="Times New Roman"/>
                 <w:b/>
-                <w:bCs/>
-                <w:lang w:val="sv-SE"/>
+                <w:sz w:val="26"/>
+                <w:szCs w:val="26"/>
+                <w:lang w:val="it-IT"/>
               </w:rPr>
             </w:pPr>
           </w:p>
           <w:p>
             <w:pPr>
+              <w:pStyle w:val="Normal0"/>
+              <w:mirrorIndents/>
               <w:jc w:val="center"/>
               <w:rPr>
-                <w:rFonts w:ascii="Times New Roman" w:hAnsi="Times New Roman" w:cs="Times New Roman"/>
                 <w:b/>
-                <w:bCs/>
-                <w:lang w:val="sv-SE"/>
+                <w:sz w:val="26"/>
+                <w:szCs w:val="26"/>
+                <w:lang w:val="it-IT"/>
               </w:rPr>
             </w:pPr>
           </w:p>
           <w:p>
             <w:pPr>
+              <w:pStyle w:val="Normal0"/>
+              <w:mirrorIndents/>
               <w:jc w:val="center"/>
               <w:rPr>
-                <w:rFonts w:ascii="Times New Roman" w:hAnsi="Times New Roman" w:cs="Times New Roman"/>
                 <w:b/>
-                <w:bCs/>
-                <w:lang w:val="sv-SE"/>
+                <w:sz w:val="26"/>
+                <w:szCs w:val="26"/>
+                <w:lang w:val="it-IT"/>
               </w:rPr>
             </w:pPr>
           </w:p>
         </w:tc>
         <w:tc>
           <w:tcPr>
-            <w:tcW w:w="5385" w:type="dxa"/>
+            <w:tcW w:w="5670" w:type="dxa"/>
+            <w:tcBorders>
+              <w:top w:val="single" w:sz="4" w:space="0" w:color="auto"/>
+              <w:left w:val="single" w:sz="4" w:space="0" w:color="auto"/>
+              <w:bottom w:val="single" w:sz="4" w:space="0" w:color="auto"/>
+              <w:right w:val="single" w:sz="4" w:space="0" w:color="auto"/>
+            </w:tcBorders>
+            <w:hideMark/>
           </w:tcPr>
           <w:p>
             <w:pPr>
+              <w:pStyle w:val="Normal0"/>
+              <w:mirrorIndents/>
               <w:jc w:val="center"/>
               <w:rPr>
-                <w:rFonts w:ascii="Times New Roman" w:hAnsi="Times New Roman" w:cs="Times New Roman"/>
                 <w:b/>
-                <w:bCs/>
-                <w:lang w:val="sv-SE"/>
+                <w:sz w:val="26"/>
+                <w:szCs w:val="26"/>
+                <w:lang w:val="it-IT"/>
               </w:rPr>
             </w:pPr>
             <w:r>
               <w:rPr>
-                <w:rFonts w:ascii="Times New Roman" w:hAnsi="Times New Roman" w:cs="Times New Roman"/>
+                <w:noProof/>
+              </w:rPr>
+              <mc:AlternateContent>
+                <mc:Choice Requires="wps">
+                  <w:drawing>
+                    <wp:anchor distT="0" distB="0" distL="114300" distR="114300" simplePos="0" relativeHeight="251661312" behindDoc="0" locked="0" layoutInCell="0" allowOverlap="1" wp14:anchorId="59DB6849" wp14:editId="513CADC8">
+                      <wp:simplePos x="0" y="0"/>
+                      <wp:positionH relativeFrom="column">
+                        <wp:posOffset>2470150</wp:posOffset>
+                      </wp:positionH>
+                      <wp:positionV relativeFrom="paragraph">
+                        <wp:posOffset>903605</wp:posOffset>
+                      </wp:positionV>
+                      <wp:extent cx="1053465" cy="304800"/>
+                      <wp:effectExtent l="0" t="0" r="13335" b="19050"/>
+                      <wp:wrapNone/>
+                      <wp:docPr id="532350324" name="Rectangle 532350324"/>
+                      <wp:cNvGraphicFramePr>
+                        <a:graphicFrameLocks xmlns:a="http://schemas.openxmlformats.org/drawingml/2006/main"/>
+                      </wp:cNvGraphicFramePr>
+                      <a:graphic xmlns:a="http://schemas.openxmlformats.org/drawingml/2006/main">
+                        <a:graphicData uri="http://schemas.microsoft.com/office/word/2010/wordprocessingShape">
+                          <wps:wsp>
+                            <wps:cNvSpPr>
+                              <a:spLocks noChangeArrowheads="1"/>
+                            </wps:cNvSpPr>
+                            <wps:spPr bwMode="auto">
+                              <a:xfrm>
+                                <a:off x="0" y="0"/>
+                                <a:ext cx="1053465" cy="304800"/>
+                              </a:xfrm>
+                              <a:prstGeom prst="rect">
+                                <a:avLst/>
+                              </a:prstGeom>
+                              <a:solidFill>
+                                <a:srgbClr val="FFFFFF"/>
+                              </a:solidFill>
+                              <a:ln w="9525">
+                                <a:solidFill>
+                                  <a:srgbClr val="000000"/>
+                                </a:solidFill>
+                                <a:miter lim="800000"/>
+                                <a:headEnd/>
+                                <a:tailEnd/>
+                              </a:ln>
+                            </wps:spPr>
+                            <wps:txbx>
+                              <w:txbxContent>
+                                <w:p>
+                                  <w:pPr>
+                                    <w:rPr>
+                                      <w:rFonts w:ascii="Cambria" w:hAnsi="Cambria" w:cs="Cambria"/>
+                                      <w:sz w:val="26"/>
+                                      <w:szCs w:val="26"/>
+                                    </w:rPr>
+                                  </w:pPr>
+                                  <w:r>
+                                    <w:rPr>
+                                      <w:rFonts w:ascii="Cambria" w:hAnsi="Cambria" w:cs="Cambria"/>
+                                      <w:b/>
+                                      <w:bCs/>
+                                      <w:sz w:val="26"/>
+                                      <w:szCs w:val="26"/>
+                                    </w:rPr>
+                                    <w:t xml:space="preserve">Đề </w:t>
+                                  </w:r>
+                                  <w:r>
+                                    <w:rPr>
+                                      <w:rFonts w:ascii="Cambria" w:hAnsi="Cambria" w:cs="Cambria"/>
+                                      <w:b/>
+                                      <w:bCs/>
+                                      <w:sz w:val="26"/>
+                                      <w:szCs w:val="26"/>
+                                    </w:rPr>
+                                    <w:t>${so}</w:t>
+                                  </w:r>
+                                </w:p>
+                              </w:txbxContent>
+                            </wps:txbx>
+                            <wps:bodyPr rot="0" vertOverflow="clip" horzOverflow="clip" vert="horz" wrap="square" lIns="91440" tIns="45720" rIns="91440" bIns="45720" anchor="t" anchorCtr="0" upright="1">
+                              <a:noAutofit/>
+                            </wps:bodyPr>
+                          </wps:wsp>
+                        </a:graphicData>
+                      </a:graphic>
+                      <wp14:sizeRelH relativeFrom="page">
+                        <wp14:pctWidth>0</wp14:pctWidth>
+                      </wp14:sizeRelH>
+                      <wp14:sizeRelV relativeFrom="page">
+                        <wp14:pctHeight>0</wp14:pctHeight>
+                      </wp14:sizeRelV>
+                    </wp:anchor>
+                  </w:drawing>
+                </mc:Choice>
+                <mc:Fallback>
+                  <w:pict>
+                    <v:rect w14:anchorId="59DB6849" id="Rectangle 532350324" o:spid="_x0000_s1026" style="position:absolute;left:0;text-align:left;margin-left:194.5pt;margin-top:71.15pt;width:82.95pt;height:24pt;z-index:251661312;visibility:visible;mso-wrap-style:square;mso-width-percent:0;mso-height-percent:0;mso-wrap-distance-left:9pt;mso-wrap-distance-top:0;mso-wrap-distance-right:9pt;mso-wrap-distance-bottom:0;mso-position-horizontal:absolute;mso-position-horizontal-relative:text;mso-position-vertical:absolute;mso-position-vertical-relative:text;mso-width-percent:0;mso-height-percent:0;mso-width-relative:page;mso-height-relative:page;v-text-anchor:top" o:gfxdata="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" o:allowincell="f">
+                      <v:textbox>
+                        <w:txbxContent>
+                          <w:p>
+                            <w:pPr>
+                              <w:rPr>
+                                <w:rFonts w:ascii="Cambria" w:hAnsi="Cambria" w:cs="Cambria"/>
+                                <w:sz w:val="26"/>
+                                <w:szCs w:val="26"/>
+                              </w:rPr>
+                            </w:pPr>
+                            <w:r>
+                              <w:rPr>
+                                <w:rFonts w:ascii="Cambria" w:hAnsi="Cambria" w:cs="Cambria"/>
+                                <w:b/>
+                                <w:bCs/>
+                                <w:sz w:val="26"/>
+                                <w:szCs w:val="26"/>
+                              </w:rPr>
+                              <w:t xml:space="preserve">Đề </w:t>
+                            </w:r>
+                            <w:r>
+                              <w:rPr>
+                                <w:rFonts w:ascii="Cambria" w:hAnsi="Cambria" w:cs="Cambria"/>
+                                <w:b/>
+                                <w:bCs/>
+                                <w:sz w:val="26"/>
+                                <w:szCs w:val="26"/>
+                              </w:rPr>
+                              <w:t>${so}</w:t>
+                            </w:r>
+                          </w:p>
+                        </w:txbxContent>
+                      </v:textbox>
+                    </v:rect>
+                  </w:pict>
+                </mc:Fallback>
+              </mc:AlternateContent>
+            </w:r>
+            <w:r>
+              <w:rPr>
                 <w:b/>
-                <w:bCs/>
-                <w:lang w:val="sv-SE"/>
+                <w:sz w:val="26"/>
+                <w:szCs w:val="26"/>
+                <w:lang w:val="it-IT"/>
               </w:rPr>
               <w:t>Lời nhận xét của giáo viên</w:t>
             </w:r>
@@ -336,107 +628,981 @@
     </w:tbl>
     <w:p>
       <w:pPr>
-        <w:numPr>
-          <w:ilvl w:val="0"/>
-          <w:numId w:val="1"/>
-        </w:numPr>
+        <w:tabs>
+          <w:tab w:val="left" w:pos="992"/>
+        </w:tabs>
+        <w:ind w:left="992" w:hanging="992"/>
+        <w:jc w:val="both"/>
+        <w:rPr>
+          <w:rFonts w:ascii="Times New Roman" w:eastAsiaTheme="minorEastAsia" w:hAnsi="Times New Roman" w:cs="Times New Roman"/>
+          <w:b/>
+          <w:sz w:val="26"/>
+          <w:szCs w:val="26"/>
+          <w:lang w:val="it-IT"/>
+        </w:rPr>
       </w:pPr>
       <w:r>
-        <w:t>${test_</w:t>
-      </w:r>
-      <w:proofErr w:type="gramStart"/>
-      <w:r>
-        <w:t>name},</w:t>
-      </w:r>
-      <w:proofErr w:type="gramEnd"/>
-      <w:r>
-        <w:t> ${created_</w:t>
-      </w:r>
-      <w:proofErr w:type="gramStart"/>
-      <w:r>
-        <w:t>at},</w:t>
-      </w:r>
-      <w:proofErr w:type="gramEnd"/>
-      <w:r>
-        <w:t> ${total_</w:t>
-      </w:r>
-      <w:proofErr w:type="gramStart"/>
-      <w:r>
-        <w:t>questions},</w:t>
-      </w:r>
-      <w:proofErr w:type="gramEnd"/>
-      <w:r>
-        <w:t> ${total_</w:t>
-      </w:r>
-      <w:proofErr w:type="gramStart"/>
-      <w:r>
-        <w:t>points},</w:t>
-      </w:r>
-      <w:proofErr w:type="gramEnd"/>
-      <w:r>
-        <w:t> ${time_limit}</w:t>
+        <w:rPr>
+          <w:rFonts w:ascii="Times New Roman" w:hAnsi="Times New Roman" w:cs="Times New Roman"/>
+          <w:b/>
+          <w:sz w:val="26"/>
+          <w:szCs w:val="26"/>
+          <w:lang w:val="it-IT"/>
+        </w:rPr>
+        <w:t xml:space="preserve">Họ và tên học sinh :................................................................ Lớp: </w:t>
+      </w:r>
+      <w:r>
+        <w:rPr>
+          <w:rFonts w:ascii="Times New Roman" w:hAnsi="Times New Roman" w:cs="Times New Roman"/>
+          <w:b/>
+          <w:sz w:val="26"/>
+          <w:szCs w:val="26"/>
+          <w:lang w:val="it-IT"/>
+        </w:rPr>
+        <w:t>{grade}</w:t>
+      </w:r>
+      <w:r>
+        <w:rPr>
+          <w:rFonts w:ascii="Times New Roman" w:hAnsi="Times New Roman" w:cs="Times New Roman"/>
+          <w:b/>
+          <w:sz w:val="26"/>
+          <w:szCs w:val="26"/>
+          <w:lang w:val="it-IT"/>
+        </w:rPr>
+        <w:t xml:space="preserve">…  </w:t>
       </w:r>
     </w:p>
     <w:p>
       <w:pPr>
-        <w:numPr>
-          <w:ilvl w:val="0"/>
-          <w:numId w:val="1"/>
-        </w:numPr>
+        <w:tabs>
+          <w:tab w:val="left" w:pos="992"/>
+        </w:tabs>
+        <w:ind w:left="992" w:hanging="992"/>
+        <w:jc w:val="both"/>
+        <w:rPr>
+          <w:rFonts w:ascii="Times New Roman" w:hAnsi="Times New Roman" w:cs="Times New Roman"/>
+          <w:b/>
+          <w:sz w:val="26"/>
+          <w:szCs w:val="26"/>
+          <w:lang w:val="it-IT"/>
+        </w:rPr>
       </w:pPr>
       <w:r>
-        <w:t>Block question_block với: ${question_</w:t>
+        <w:rPr>
+          <w:rFonts w:ascii="Times New Roman" w:hAnsi="Times New Roman" w:cs="Times New Roman"/>
+          <w:noProof/>
+        </w:rPr>
+        <mc:AlternateContent>
+          <mc:Choice Requires="wps">
+            <w:drawing>
+              <wp:anchor distT="4294967291" distB="4294967291" distL="114300" distR="114300" simplePos="0" relativeHeight="251660288" behindDoc="0" locked="0" layoutInCell="1" allowOverlap="1" wp14:anchorId="1FE3B5C3" wp14:editId="7DC0C716">
+                <wp:simplePos x="0" y="0"/>
+                <wp:positionH relativeFrom="column">
+                  <wp:posOffset>-34925</wp:posOffset>
+                </wp:positionH>
+                <wp:positionV relativeFrom="paragraph">
+                  <wp:posOffset>67309</wp:posOffset>
+                </wp:positionV>
+                <wp:extent cx="6299835" cy="0"/>
+                <wp:effectExtent l="0" t="0" r="0" b="0"/>
+                <wp:wrapNone/>
+                <wp:docPr id="805896198" name="Straight Connector 805896198"/>
+                <wp:cNvGraphicFramePr>
+                  <a:graphicFrameLocks xmlns:a="http://schemas.openxmlformats.org/drawingml/2006/main"/>
+                </wp:cNvGraphicFramePr>
+                <a:graphic xmlns:a="http://schemas.openxmlformats.org/drawingml/2006/main">
+                  <a:graphicData uri="http://schemas.microsoft.com/office/word/2010/wordprocessingShape">
+                    <wps:wsp>
+                      <wps:cNvCnPr>
+                        <a:cxnSpLocks noChangeShapeType="1"/>
+                      </wps:cNvCnPr>
+                      <wps:spPr bwMode="auto">
+                        <a:xfrm>
+                          <a:off x="0" y="0"/>
+                          <a:ext cx="6299835" cy="0"/>
+                        </a:xfrm>
+                        <a:prstGeom prst="line">
+                          <a:avLst/>
+                        </a:prstGeom>
+                        <a:noFill/>
+                        <a:ln w="9525">
+                          <a:solidFill>
+                            <a:srgbClr val="000000"/>
+                          </a:solidFill>
+                          <a:round/>
+                          <a:headEnd/>
+                          <a:tailEnd/>
+                        </a:ln>
+                      </wps:spPr>
+                      <wps:bodyPr/>
+                    </wps:wsp>
+                  </a:graphicData>
+                </a:graphic>
+                <wp14:sizeRelH relativeFrom="page">
+                  <wp14:pctWidth>0</wp14:pctWidth>
+                </wp14:sizeRelH>
+                <wp14:sizeRelV relativeFrom="page">
+                  <wp14:pctHeight>0</wp14:pctHeight>
+                </wp14:sizeRelV>
+              </wp:anchor>
+            </w:drawing>
+          </mc:Choice>
+          <mc:Fallback>
+            <w:pict>
+              <v:line w14:anchorId="7F7F37CD" id="Straight Connector 805896198" o:spid="_x0000_s1026" style="position:absolute;z-index:251660288;visibility:visible;mso-wrap-style:square;mso-width-percent:0;mso-height-percent:0;mso-wrap-distance-left:9pt;mso-wrap-distance-top:-1e-4mm;mso-wrap-distance-right:9pt;mso-wrap-distance-bottom:-1e-4mm;mso-position-horizontal:absolute;mso-position-horizontal-relative:text;mso-position-vertical:absolute;mso-position-vertical-relative:text;mso-width-percent:0;mso-height-percent:0;mso-width-relative:page;mso-height-relative:page" from="-2.75pt,5.3pt" to="493.3pt,5.3pt" o:gfxdata="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"/>
+            </w:pict>
+          </mc:Fallback>
+        </mc:AlternateContent>
+      </w:r>
+    </w:p>
+    <w:p>
+      <w:pPr>
+        <w:tabs>
+          <w:tab w:val="left" w:pos="992"/>
+        </w:tabs>
+        <w:ind w:left="992" w:hanging="992"/>
+        <w:jc w:val="both"/>
+        <w:rPr>
+          <w:rFonts w:ascii="Times New Roman" w:hAnsi="Times New Roman" w:cs="Times New Roman"/>
+          <w:b/>
+          <w:sz w:val="26"/>
+          <w:szCs w:val="26"/>
+          <w:lang w:val="it-IT"/>
+        </w:rPr>
+      </w:pPr>
+      <w:r>
+        <w:rPr>
+          <w:rFonts w:ascii="Times New Roman" w:hAnsi="Times New Roman" w:cs="Times New Roman"/>
+          <w:b/>
+          <w:sz w:val="26"/>
+          <w:szCs w:val="26"/>
+          <w:lang w:val="it-IT"/>
+        </w:rPr>
+        <w:t>I. TRẮC NGHIỆM NHIỀU PHƯƠNG ÁN LỰA CHỌN (</w:t>
+      </w:r>
+      <w:r>
+        <w:rPr>
+          <w:rFonts w:ascii="Times New Roman" w:hAnsi="Times New Roman" w:cs="Times New Roman"/>
+          <w:b/>
+          <w:sz w:val="26"/>
+          <w:szCs w:val="26"/>
+          <w:lang w:val="it-IT"/>
+        </w:rPr>
+        <w:t>${tong_diem_tracnghiem}</w:t>
+      </w:r>
+      <w:r>
+        <w:rPr>
+          <w:rFonts w:ascii="Times New Roman" w:hAnsi="Times New Roman" w:cs="Times New Roman"/>
+          <w:b/>
+          <w:sz w:val="26"/>
+          <w:szCs w:val="26"/>
+          <w:lang w:val="it-IT"/>
+        </w:rPr>
+        <w:t xml:space="preserve"> điểm)</w:t>
+      </w:r>
+    </w:p>
+    <w:p>
+      <w:pPr>
+        <w:tabs>
+          <w:tab w:val="left" w:pos="142"/>
+        </w:tabs>
+        <w:ind w:left="142" w:hanging="142"/>
+        <w:jc w:val="both"/>
+        <w:rPr>
+          <w:rFonts w:ascii="Times New Roman" w:hAnsi="Times New Roman" w:cs="Times New Roman"/>
+          <w:b/>
+          <w:i/>
+          <w:sz w:val="26"/>
+          <w:szCs w:val="26"/>
+          <w:lang w:val="it-IT"/>
+        </w:rPr>
+      </w:pPr>
+      <w:r>
+        <w:rPr>
+          <w:rFonts w:ascii="Times New Roman" w:hAnsi="Times New Roman" w:cs="Times New Roman"/>
+          <w:b/>
+          <w:i/>
+          <w:sz w:val="26"/>
+          <w:szCs w:val="26"/>
+          <w:lang w:val="it-IT"/>
+        </w:rPr>
+        <w:t xml:space="preserve">Học sinh trả lời từ câu 1 đến câu </w:t>
+      </w:r>
+      <w:r>
+        <w:rPr>
+          <w:rFonts w:ascii="Times New Roman" w:hAnsi="Times New Roman" w:cs="Times New Roman"/>
+          <w:b/>
+          <w:i/>
+          <w:sz w:val="26"/>
+          <w:szCs w:val="26"/>
+          <w:lang w:val="it-IT"/>
+        </w:rPr>
+        <w:t>${max_cau_tracnghiem}</w:t>
+      </w:r>
+      <w:r>
+        <w:rPr>
+          <w:rFonts w:ascii="Times New Roman" w:hAnsi="Times New Roman" w:cs="Times New Roman"/>
+          <w:b/>
+          <w:i/>
+          <w:sz w:val="26"/>
+          <w:szCs w:val="26"/>
+          <w:lang w:val="it-IT"/>
+        </w:rPr>
+        <w:t xml:space="preserve">, mỗi câu hỏi học sinh chỉ chọn một phương án. Mỗi câu đúng được </w:t>
+      </w:r>
+      <w:r>
+        <w:rPr>
+          <w:rFonts w:ascii="Times New Roman" w:hAnsi="Times New Roman" w:cs="Times New Roman"/>
+          <w:b/>
+          <w:i/>
+          <w:sz w:val="26"/>
+          <w:szCs w:val="26"/>
+          <w:lang w:val="it-IT"/>
+        </w:rPr>
+        <w:t>${</w:t>
+      </w:r>
+      <w:r>
+        <w:rPr>
+          <w:rFonts w:ascii="Times New Roman" w:hAnsi="Times New Roman" w:cs="Times New Roman"/>
+          <w:b/>
+          <w:sz w:val="26"/>
+          <w:szCs w:val="26"/>
+          <w:lang w:val="it-IT"/>
+        </w:rPr>
+        <w:t xml:space="preserve"> </w:t>
+      </w:r>
+      <w:r>
+        <w:rPr>
+          <w:rFonts w:ascii="Times New Roman" w:hAnsi="Times New Roman" w:cs="Times New Roman"/>
+          <w:b/>
+          <w:sz w:val="26"/>
+          <w:szCs w:val="26"/>
+          <w:lang w:val="it-IT"/>
+        </w:rPr>
+        <w:t>diem_tracnghiem</w:t>
+      </w:r>
+      <w:r>
+        <w:rPr>
+          <w:rFonts w:ascii="Times New Roman" w:hAnsi="Times New Roman" w:cs="Times New Roman"/>
+          <w:b/>
+          <w:sz w:val="26"/>
+          <w:szCs w:val="26"/>
+          <w:lang w:val="it-IT"/>
+        </w:rPr>
+        <w:t>}</w:t>
+      </w:r>
+      <w:r>
+        <w:rPr>
+          <w:rFonts w:ascii="Times New Roman" w:hAnsi="Times New Roman" w:cs="Times New Roman"/>
+          <w:b/>
+          <w:i/>
+          <w:sz w:val="26"/>
+          <w:szCs w:val="26"/>
+          <w:lang w:val="it-IT"/>
+        </w:rPr>
+        <w:t xml:space="preserve"> điểm.</w:t>
+      </w:r>
+    </w:p>
+    <w:p>
+      <w:pPr>
+        <w:rPr>
+          <w:rFonts w:ascii="Times New Roman" w:eastAsia="Times New Roman" w:hAnsi="Times New Roman" w:cs="Times New Roman"/>
+          <w:b/>
+          <w:bCs/>
+          <w:lang w:val="it-IT"/>
+        </w:rPr>
+      </w:pPr>
+      <w:r>
+        <w:rPr>
+          <w:rFonts w:ascii="Times New Roman" w:eastAsia="Times New Roman" w:hAnsi="Times New Roman" w:cs="Times New Roman"/>
+          <w:b/>
+          <w:bCs/>
+          <w:lang w:val="it-IT"/>
+        </w:rPr>
+        <w:t>${questions_tracnghiem}</w:t>
+      </w:r>
+    </w:p>
+    <w:p>
+      <w:pPr>
+        <w:rPr>
+          <w:rFonts w:ascii="Times New Roman" w:eastAsia="Times New Roman" w:hAnsi="Times New Roman" w:cs="Times New Roman"/>
+          <w:b/>
+          <w:sz w:val="26"/>
+          <w:szCs w:val="26"/>
+          <w:lang w:val="it-IT"/>
+        </w:rPr>
+      </w:pPr>
+      <w:r>
+        <w:rPr>
+          <w:rFonts w:ascii="Times New Roman" w:eastAsia="Times New Roman" w:hAnsi="Times New Roman" w:cs="Times New Roman"/>
+          <w:b/>
+          <w:sz w:val="26"/>
+          <w:szCs w:val="26"/>
+          <w:lang w:val="it-IT"/>
+        </w:rPr>
+        <w:t>II. TRẮC NGHIỆM ĐÚNG SAI (</w:t>
+      </w:r>
+      <w:r>
+        <w:rPr>
+          <w:rFonts w:ascii="Times New Roman" w:hAnsi="Times New Roman" w:cs="Times New Roman"/>
+          <w:b/>
+          <w:sz w:val="26"/>
+          <w:szCs w:val="26"/>
+          <w:lang w:val="it-IT"/>
+        </w:rPr>
+        <w:t>(</w:t>
+      </w:r>
+      <w:r>
+        <w:rPr>
+          <w:rFonts w:ascii="Times New Roman" w:hAnsi="Times New Roman" w:cs="Times New Roman"/>
+          <w:b/>
+          <w:sz w:val="26"/>
+          <w:szCs w:val="26"/>
+          <w:lang w:val="it-IT"/>
+        </w:rPr>
+        <w:t>${tong_diem_</w:t>
+      </w:r>
+      <w:r>
+        <w:rPr>
+          <w:rFonts w:ascii="Times New Roman" w:hAnsi="Times New Roman" w:cs="Times New Roman"/>
+          <w:b/>
+          <w:sz w:val="26"/>
+          <w:szCs w:val="26"/>
+          <w:lang w:val="it-IT"/>
+        </w:rPr>
+        <w:t>dungsai</w:t>
+      </w:r>
+      <w:r>
+        <w:rPr>
+          <w:rFonts w:ascii="Times New Roman" w:hAnsi="Times New Roman" w:cs="Times New Roman"/>
+          <w:b/>
+          <w:sz w:val="26"/>
+          <w:szCs w:val="26"/>
+          <w:lang w:val="it-IT"/>
+        </w:rPr>
+        <w:t>}</w:t>
+      </w:r>
+      <w:r>
+        <w:rPr>
+          <w:rFonts w:ascii="Times New Roman" w:eastAsia="Times New Roman" w:hAnsi="Times New Roman" w:cs="Times New Roman"/>
+          <w:b/>
+          <w:sz w:val="26"/>
+          <w:szCs w:val="26"/>
+          <w:lang w:val="it-IT"/>
+        </w:rPr>
+        <w:t xml:space="preserve"> điểm)</w:t>
+      </w:r>
+    </w:p>
+    <w:p>
+      <w:pPr>
+        <w:tabs>
+          <w:tab w:val="left" w:pos="283"/>
+          <w:tab w:val="left" w:pos="2835"/>
+          <w:tab w:val="left" w:pos="5386"/>
+          <w:tab w:val="left" w:pos="7937"/>
+        </w:tabs>
+        <w:jc w:val="both"/>
+        <w:rPr>
+          <w:rFonts w:ascii="Times New Roman" w:eastAsia="Times New Roman" w:hAnsi="Times New Roman" w:cs="Times New Roman"/>
+          <w:b/>
+          <w:bCs/>
+          <w:i/>
+          <w:sz w:val="26"/>
+          <w:szCs w:val="26"/>
+          <w:lang w:val="it-IT"/>
+        </w:rPr>
+      </w:pPr>
+      <w:r>
+        <w:rPr>
+          <w:rFonts w:ascii="Times New Roman" w:eastAsia="Times New Roman" w:hAnsi="Times New Roman" w:cs="Times New Roman"/>
+          <w:b/>
+          <w:bCs/>
+          <w:i/>
+          <w:sz w:val="26"/>
+          <w:szCs w:val="26"/>
+          <w:lang w:val="it-IT"/>
+        </w:rPr>
+        <w:t xml:space="preserve">Học sinh trả lời từ câu 1 đến câu </w:t>
+      </w:r>
+      <w:r>
+        <w:rPr>
+          <w:rFonts w:ascii="Times New Roman" w:hAnsi="Times New Roman" w:cs="Times New Roman"/>
+          <w:b/>
+          <w:i/>
+          <w:sz w:val="26"/>
+          <w:szCs w:val="26"/>
+          <w:lang w:val="it-IT"/>
+        </w:rPr>
+        <w:t>${max_cau_</w:t>
+      </w:r>
+      <w:r>
+        <w:rPr>
+          <w:rFonts w:ascii="Times New Roman" w:hAnsi="Times New Roman" w:cs="Times New Roman"/>
+          <w:b/>
+          <w:i/>
+          <w:sz w:val="26"/>
+          <w:szCs w:val="26"/>
+          <w:lang w:val="it-IT"/>
+        </w:rPr>
+        <w:t>dungsai</w:t>
+      </w:r>
+      <w:r>
+        <w:rPr>
+          <w:rFonts w:ascii="Times New Roman" w:hAnsi="Times New Roman" w:cs="Times New Roman"/>
+          <w:b/>
+          <w:i/>
+          <w:sz w:val="26"/>
+          <w:szCs w:val="26"/>
+          <w:lang w:val="it-IT"/>
+        </w:rPr>
+        <w:t>}</w:t>
+      </w:r>
+      <w:r>
+        <w:rPr>
+          <w:rFonts w:ascii="Times New Roman" w:eastAsia="Times New Roman" w:hAnsi="Times New Roman" w:cs="Times New Roman"/>
+          <w:b/>
+          <w:bCs/>
+          <w:i/>
+          <w:sz w:val="26"/>
+          <w:szCs w:val="26"/>
+          <w:lang w:val="it-IT"/>
+        </w:rPr>
+        <w:t>. Trong mỗi ý a), b), c), d) ở mỗi câu, học sinh ghi đúng hoặc sai.</w:t>
+      </w:r>
+    </w:p>
+    <w:p>
+      <w:pPr>
+        <w:rPr>
+          <w:rFonts w:ascii="Times New Roman" w:eastAsia="Times New Roman" w:hAnsi="Times New Roman" w:cs="Times New Roman"/>
+          <w:lang w:val="it-IT"/>
+        </w:rPr>
+      </w:pPr>
+      <w:r>
+        <w:rPr>
+          <w:rFonts w:ascii="Times New Roman" w:eastAsia="Times New Roman" w:hAnsi="Times New Roman" w:cs="Times New Roman"/>
+          <w:b/>
+          <w:bCs/>
+          <w:lang w:val="it-IT"/>
+        </w:rPr>
+        <w:t>${question</w:t>
+      </w:r>
+      <w:r>
+        <w:rPr>
+          <w:rFonts w:ascii="Times New Roman" w:eastAsia="Times New Roman" w:hAnsi="Times New Roman" w:cs="Times New Roman"/>
+          <w:b/>
+          <w:bCs/>
+          <w:lang w:val="it-IT"/>
+        </w:rPr>
+        <w:t>_ds_1</w:t>
+      </w:r>
+      <w:r>
+        <w:rPr>
+          <w:rFonts w:ascii="Times New Roman" w:eastAsia="Times New Roman" w:hAnsi="Times New Roman" w:cs="Times New Roman"/>
+          <w:b/>
+          <w:bCs/>
+          <w:lang w:val="it-IT"/>
+        </w:rPr>
+        <w:t>}</w:t>
+      </w:r>
+    </w:p>
+    <w:tbl>
+      <w:tblPr>
+        <w:tblStyle w:val="TableGrid"/>
+        <w:tblW w:w="0" w:type="auto"/>
+        <w:tblInd w:w="622" w:type="dxa"/>
+        <w:tblLook w:val="04A0" w:firstRow="1" w:lastRow="0" w:firstColumn="1" w:lastColumn="0" w:noHBand="0" w:noVBand="1"/>
+      </w:tblPr>
+      <w:tblGrid>
+        <w:gridCol w:w="2096"/>
+        <w:gridCol w:w="2101"/>
+        <w:gridCol w:w="2097"/>
+        <w:gridCol w:w="2101"/>
+      </w:tblGrid>
+      <w:tr>
+        <w:tc>
+          <w:tcPr>
+            <w:tcW w:w="2096" w:type="dxa"/>
+            <w:tcBorders>
+              <w:top w:val="single" w:sz="4" w:space="0" w:color="auto"/>
+              <w:left w:val="single" w:sz="4" w:space="0" w:color="auto"/>
+              <w:bottom w:val="single" w:sz="4" w:space="0" w:color="auto"/>
+              <w:right w:val="single" w:sz="4" w:space="0" w:color="auto"/>
+            </w:tcBorders>
+            <w:hideMark/>
+          </w:tcPr>
+          <w:p>
+            <w:pPr>
+              <w:tabs>
+                <w:tab w:val="left" w:pos="283"/>
+                <w:tab w:val="left" w:pos="2835"/>
+                <w:tab w:val="left" w:pos="5386"/>
+                <w:tab w:val="left" w:pos="7937"/>
+              </w:tabs>
+              <w:ind w:left="283"/>
+              <w:jc w:val="both"/>
+              <w:rPr>
+                <w:rFonts w:ascii="Times New Roman" w:eastAsia="Times New Roman" w:hAnsi="Times New Roman" w:cs="Times New Roman"/>
+                <w:sz w:val="26"/>
+                <w:szCs w:val="26"/>
+              </w:rPr>
+            </w:pPr>
+            <w:r>
+              <w:rPr>
+                <w:rFonts w:ascii="Times New Roman" w:eastAsia="Times New Roman" w:hAnsi="Times New Roman" w:cs="Times New Roman"/>
+                <w:sz w:val="26"/>
+                <w:szCs w:val="26"/>
+              </w:rPr>
+              <w:t xml:space="preserve">a)  </w:t>
+            </w:r>
+          </w:p>
+        </w:tc>
+        <w:tc>
+          <w:tcPr>
+            <w:tcW w:w="2101" w:type="dxa"/>
+            <w:tcBorders>
+              <w:top w:val="single" w:sz="4" w:space="0" w:color="auto"/>
+              <w:left w:val="single" w:sz="4" w:space="0" w:color="auto"/>
+              <w:bottom w:val="single" w:sz="4" w:space="0" w:color="auto"/>
+              <w:right w:val="single" w:sz="4" w:space="0" w:color="auto"/>
+            </w:tcBorders>
+            <w:hideMark/>
+          </w:tcPr>
+          <w:p>
+            <w:pPr>
+              <w:tabs>
+                <w:tab w:val="left" w:pos="283"/>
+                <w:tab w:val="left" w:pos="2835"/>
+                <w:tab w:val="left" w:pos="5386"/>
+                <w:tab w:val="left" w:pos="7937"/>
+              </w:tabs>
+              <w:ind w:left="283"/>
+              <w:jc w:val="both"/>
+              <w:rPr>
+                <w:rFonts w:ascii="Times New Roman" w:eastAsia="Times New Roman" w:hAnsi="Times New Roman" w:cs="Times New Roman"/>
+                <w:sz w:val="26"/>
+                <w:szCs w:val="26"/>
+              </w:rPr>
+            </w:pPr>
+            <w:r>
+              <w:rPr>
+                <w:rFonts w:ascii="Times New Roman" w:eastAsia="Times New Roman" w:hAnsi="Times New Roman" w:cs="Times New Roman"/>
+                <w:sz w:val="26"/>
+                <w:szCs w:val="26"/>
+              </w:rPr>
+              <w:t xml:space="preserve">b) </w:t>
+            </w:r>
+          </w:p>
+        </w:tc>
+        <w:tc>
+          <w:tcPr>
+            <w:tcW w:w="2097" w:type="dxa"/>
+            <w:tcBorders>
+              <w:top w:val="single" w:sz="4" w:space="0" w:color="auto"/>
+              <w:left w:val="single" w:sz="4" w:space="0" w:color="auto"/>
+              <w:bottom w:val="single" w:sz="4" w:space="0" w:color="auto"/>
+              <w:right w:val="single" w:sz="4" w:space="0" w:color="auto"/>
+            </w:tcBorders>
+            <w:hideMark/>
+          </w:tcPr>
+          <w:p>
+            <w:pPr>
+              <w:tabs>
+                <w:tab w:val="left" w:pos="283"/>
+                <w:tab w:val="left" w:pos="2835"/>
+                <w:tab w:val="left" w:pos="5386"/>
+                <w:tab w:val="left" w:pos="7937"/>
+              </w:tabs>
+              <w:ind w:left="283"/>
+              <w:jc w:val="both"/>
+              <w:rPr>
+                <w:rFonts w:ascii="Times New Roman" w:eastAsia="Times New Roman" w:hAnsi="Times New Roman" w:cs="Times New Roman"/>
+                <w:sz w:val="26"/>
+                <w:szCs w:val="26"/>
+              </w:rPr>
+            </w:pPr>
+            <w:r>
+              <w:rPr>
+                <w:rFonts w:ascii="Times New Roman" w:eastAsia="Times New Roman" w:hAnsi="Times New Roman" w:cs="Times New Roman"/>
+                <w:sz w:val="26"/>
+                <w:szCs w:val="26"/>
+              </w:rPr>
+              <w:t xml:space="preserve">c) </w:t>
+            </w:r>
+          </w:p>
+        </w:tc>
+        <w:tc>
+          <w:tcPr>
+            <w:tcW w:w="2101" w:type="dxa"/>
+            <w:tcBorders>
+              <w:top w:val="single" w:sz="4" w:space="0" w:color="auto"/>
+              <w:left w:val="single" w:sz="4" w:space="0" w:color="auto"/>
+              <w:bottom w:val="single" w:sz="4" w:space="0" w:color="auto"/>
+              <w:right w:val="single" w:sz="4" w:space="0" w:color="auto"/>
+            </w:tcBorders>
+            <w:hideMark/>
+          </w:tcPr>
+          <w:p>
+            <w:pPr>
+              <w:tabs>
+                <w:tab w:val="left" w:pos="283"/>
+                <w:tab w:val="left" w:pos="2835"/>
+                <w:tab w:val="left" w:pos="5386"/>
+                <w:tab w:val="left" w:pos="7937"/>
+              </w:tabs>
+              <w:ind w:left="283"/>
+              <w:jc w:val="both"/>
+              <w:rPr>
+                <w:rFonts w:ascii="Times New Roman" w:eastAsia="Times New Roman" w:hAnsi="Times New Roman" w:cs="Times New Roman"/>
+                <w:sz w:val="26"/>
+                <w:szCs w:val="26"/>
+              </w:rPr>
+            </w:pPr>
+            <w:r>
+              <w:rPr>
+                <w:rFonts w:ascii="Times New Roman" w:eastAsia="Times New Roman" w:hAnsi="Times New Roman" w:cs="Times New Roman"/>
+                <w:sz w:val="26"/>
+                <w:szCs w:val="26"/>
+              </w:rPr>
+              <w:t xml:space="preserve">d) </w:t>
+            </w:r>
+          </w:p>
+        </w:tc>
+      </w:tr>
+    </w:tbl>
+    <w:p>
+      <w:pPr>
+        <w:rPr>
+          <w:rFonts w:ascii="Times New Roman" w:eastAsiaTheme="minorEastAsia" w:hAnsi="Times New Roman" w:cs="Times New Roman"/>
+        </w:rPr>
+      </w:pPr>
+      <w:r>
+        <w:rPr>
+          <w:rFonts w:ascii="Times New Roman" w:eastAsia="Times New Roman" w:hAnsi="Times New Roman" w:cs="Times New Roman"/>
+          <w:b/>
+          <w:bCs/>
+          <w:lang w:val="it-IT"/>
+        </w:rPr>
+        <w:t>${question_ds_</w:t>
+      </w:r>
+      <w:r>
+        <w:rPr>
+          <w:rFonts w:ascii="Times New Roman" w:eastAsia="Times New Roman" w:hAnsi="Times New Roman" w:cs="Times New Roman"/>
+          <w:b/>
+          <w:bCs/>
+          <w:lang w:val="it-IT"/>
+        </w:rPr>
+        <w:t>2</w:t>
+      </w:r>
+      <w:r>
+        <w:rPr>
+          <w:rFonts w:ascii="Times New Roman" w:eastAsia="Times New Roman" w:hAnsi="Times New Roman" w:cs="Times New Roman"/>
+          <w:b/>
+          <w:bCs/>
+          <w:lang w:val="it-IT"/>
+        </w:rPr>
+        <w:t>}</w:t>
+      </w:r>
+    </w:p>
+    <w:tbl>
+      <w:tblPr>
+        <w:tblStyle w:val="TableGrid"/>
+        <w:tblW w:w="0" w:type="auto"/>
+        <w:tblInd w:w="622" w:type="dxa"/>
+        <w:tblLook w:val="04A0" w:firstRow="1" w:lastRow="0" w:firstColumn="1" w:lastColumn="0" w:noHBand="0" w:noVBand="1"/>
+      </w:tblPr>
+      <w:tblGrid>
+        <w:gridCol w:w="2096"/>
+        <w:gridCol w:w="2101"/>
+        <w:gridCol w:w="2097"/>
+        <w:gridCol w:w="2101"/>
+      </w:tblGrid>
+      <w:tr>
+        <w:tc>
+          <w:tcPr>
+            <w:tcW w:w="2096" w:type="dxa"/>
+            <w:tcBorders>
+              <w:top w:val="single" w:sz="4" w:space="0" w:color="auto"/>
+              <w:left w:val="single" w:sz="4" w:space="0" w:color="auto"/>
+              <w:bottom w:val="single" w:sz="4" w:space="0" w:color="auto"/>
+              <w:right w:val="single" w:sz="4" w:space="0" w:color="auto"/>
+            </w:tcBorders>
+            <w:hideMark/>
+          </w:tcPr>
+          <w:p>
+            <w:pPr>
+              <w:tabs>
+                <w:tab w:val="left" w:pos="283"/>
+                <w:tab w:val="left" w:pos="2835"/>
+                <w:tab w:val="left" w:pos="5386"/>
+                <w:tab w:val="left" w:pos="7937"/>
+              </w:tabs>
+              <w:ind w:left="283"/>
+              <w:jc w:val="both"/>
+              <w:rPr>
+                <w:rFonts w:ascii="Times New Roman" w:eastAsia="Times New Roman" w:hAnsi="Times New Roman" w:cs="Times New Roman"/>
+                <w:sz w:val="26"/>
+                <w:szCs w:val="26"/>
+              </w:rPr>
+            </w:pPr>
+            <w:r>
+              <w:rPr>
+                <w:rFonts w:ascii="Times New Roman" w:eastAsia="Times New Roman" w:hAnsi="Times New Roman" w:cs="Times New Roman"/>
+                <w:sz w:val="26"/>
+                <w:szCs w:val="26"/>
+              </w:rPr>
+              <w:t xml:space="preserve">a)  </w:t>
+            </w:r>
+          </w:p>
+        </w:tc>
+        <w:tc>
+          <w:tcPr>
+            <w:tcW w:w="2101" w:type="dxa"/>
+            <w:tcBorders>
+              <w:top w:val="single" w:sz="4" w:space="0" w:color="auto"/>
+              <w:left w:val="single" w:sz="4" w:space="0" w:color="auto"/>
+              <w:bottom w:val="single" w:sz="4" w:space="0" w:color="auto"/>
+              <w:right w:val="single" w:sz="4" w:space="0" w:color="auto"/>
+            </w:tcBorders>
+            <w:hideMark/>
+          </w:tcPr>
+          <w:p>
+            <w:pPr>
+              <w:tabs>
+                <w:tab w:val="left" w:pos="283"/>
+                <w:tab w:val="left" w:pos="2835"/>
+                <w:tab w:val="left" w:pos="5386"/>
+                <w:tab w:val="left" w:pos="7937"/>
+              </w:tabs>
+              <w:ind w:left="283"/>
+              <w:jc w:val="both"/>
+              <w:rPr>
+                <w:rFonts w:ascii="Times New Roman" w:eastAsia="Times New Roman" w:hAnsi="Times New Roman" w:cs="Times New Roman"/>
+                <w:sz w:val="26"/>
+                <w:szCs w:val="26"/>
+              </w:rPr>
+            </w:pPr>
+            <w:r>
+              <w:rPr>
+                <w:rFonts w:ascii="Times New Roman" w:eastAsia="Times New Roman" w:hAnsi="Times New Roman" w:cs="Times New Roman"/>
+                <w:sz w:val="26"/>
+                <w:szCs w:val="26"/>
+              </w:rPr>
+              <w:t xml:space="preserve">b) </w:t>
+            </w:r>
+          </w:p>
+        </w:tc>
+        <w:tc>
+          <w:tcPr>
+            <w:tcW w:w="2097" w:type="dxa"/>
+            <w:tcBorders>
+              <w:top w:val="single" w:sz="4" w:space="0" w:color="auto"/>
+              <w:left w:val="single" w:sz="4" w:space="0" w:color="auto"/>
+              <w:bottom w:val="single" w:sz="4" w:space="0" w:color="auto"/>
+              <w:right w:val="single" w:sz="4" w:space="0" w:color="auto"/>
+            </w:tcBorders>
+            <w:hideMark/>
+          </w:tcPr>
+          <w:p>
+            <w:pPr>
+              <w:tabs>
+                <w:tab w:val="left" w:pos="283"/>
+                <w:tab w:val="left" w:pos="2835"/>
+                <w:tab w:val="left" w:pos="5386"/>
+                <w:tab w:val="left" w:pos="7937"/>
+              </w:tabs>
+              <w:ind w:left="283"/>
+              <w:jc w:val="both"/>
+              <w:rPr>
+                <w:rFonts w:ascii="Times New Roman" w:eastAsia="Times New Roman" w:hAnsi="Times New Roman" w:cs="Times New Roman"/>
+                <w:sz w:val="26"/>
+                <w:szCs w:val="26"/>
+              </w:rPr>
+            </w:pPr>
+            <w:r>
+              <w:rPr>
+                <w:rFonts w:ascii="Times New Roman" w:eastAsia="Times New Roman" w:hAnsi="Times New Roman" w:cs="Times New Roman"/>
+                <w:sz w:val="26"/>
+                <w:szCs w:val="26"/>
+              </w:rPr>
+              <w:t xml:space="preserve">c) </w:t>
+            </w:r>
+          </w:p>
+        </w:tc>
+        <w:tc>
+          <w:tcPr>
+            <w:tcW w:w="2101" w:type="dxa"/>
+            <w:tcBorders>
+              <w:top w:val="single" w:sz="4" w:space="0" w:color="auto"/>
+              <w:left w:val="single" w:sz="4" w:space="0" w:color="auto"/>
+              <w:bottom w:val="single" w:sz="4" w:space="0" w:color="auto"/>
+              <w:right w:val="single" w:sz="4" w:space="0" w:color="auto"/>
+            </w:tcBorders>
+            <w:hideMark/>
+          </w:tcPr>
+          <w:p>
+            <w:pPr>
+              <w:tabs>
+                <w:tab w:val="left" w:pos="283"/>
+                <w:tab w:val="left" w:pos="2835"/>
+                <w:tab w:val="left" w:pos="5386"/>
+                <w:tab w:val="left" w:pos="7937"/>
+              </w:tabs>
+              <w:ind w:left="283"/>
+              <w:jc w:val="both"/>
+              <w:rPr>
+                <w:rFonts w:ascii="Times New Roman" w:eastAsia="Times New Roman" w:hAnsi="Times New Roman" w:cs="Times New Roman"/>
+                <w:sz w:val="26"/>
+                <w:szCs w:val="26"/>
+              </w:rPr>
+            </w:pPr>
+            <w:r>
+              <w:rPr>
+                <w:rFonts w:ascii="Times New Roman" w:eastAsia="Times New Roman" w:hAnsi="Times New Roman" w:cs="Times New Roman"/>
+                <w:sz w:val="26"/>
+                <w:szCs w:val="26"/>
+              </w:rPr>
+              <w:t xml:space="preserve">d) </w:t>
+            </w:r>
+          </w:p>
+        </w:tc>
+      </w:tr>
+    </w:tbl>
+    <w:p>
+      <w:pPr>
+        <w:rPr>
+          <w:rFonts w:ascii="Times New Roman" w:eastAsia="Times New Roman" w:hAnsi="Times New Roman" w:cs="Times New Roman"/>
+          <w:b/>
+          <w:bCs/>
+        </w:rPr>
+      </w:pPr>
+      <w:r>
+        <w:rPr>
+          <w:rFonts w:ascii="Times New Roman" w:eastAsia="Times New Roman" w:hAnsi="Times New Roman" w:cs="Times New Roman"/>
+          <w:b/>
+          <w:bCs/>
+        </w:rPr>
+        <w:t>III. TỰ LUẬN (</w:t>
+      </w:r>
+      <w:r>
+        <w:rPr>
+          <w:rFonts w:ascii="Times New Roman" w:hAnsi="Times New Roman" w:cs="Times New Roman"/>
+          <w:b/>
+          <w:sz w:val="26"/>
+          <w:szCs w:val="26"/>
+          <w:lang w:val="it-IT"/>
+        </w:rPr>
+        <w:t>${tong_diem_</w:t>
       </w:r>
       <w:proofErr w:type="gramStart"/>
       <w:r>
-        <w:t>text},</w:t>
+        <w:rPr>
+          <w:rFonts w:ascii="Times New Roman" w:hAnsi="Times New Roman" w:cs="Times New Roman"/>
+          <w:b/>
+          <w:sz w:val="26"/>
+          <w:szCs w:val="26"/>
+          <w:lang w:val="it-IT"/>
+        </w:rPr>
+        <w:t>tuluan</w:t>
+      </w:r>
+      <w:r>
+        <w:rPr>
+          <w:rFonts w:ascii="Times New Roman" w:hAnsi="Times New Roman" w:cs="Times New Roman"/>
+          <w:b/>
+          <w:sz w:val="26"/>
+          <w:szCs w:val="26"/>
+          <w:lang w:val="it-IT"/>
+        </w:rPr>
+        <w:t>}</w:t>
+      </w:r>
+      <w:r>
+        <w:rPr>
+          <w:rFonts w:ascii="Times New Roman" w:eastAsia="Times New Roman" w:hAnsi="Times New Roman" w:cs="Times New Roman"/>
+          <w:b/>
+          <w:sz w:val="26"/>
+          <w:szCs w:val="26"/>
+          <w:lang w:val="it-IT"/>
+        </w:rPr>
+        <w:t xml:space="preserve"> </w:t>
+      </w:r>
+      <w:r>
+        <w:rPr>
+          <w:rFonts w:ascii="Times New Roman" w:eastAsia="Times New Roman" w:hAnsi="Times New Roman" w:cs="Times New Roman"/>
+          <w:b/>
+          <w:bCs/>
+        </w:rPr>
+        <w:t xml:space="preserve"> điểm</w:t>
       </w:r>
       <w:proofErr w:type="gramEnd"/>
       <w:r>
-        <w:t> ${option_</w:t>
-      </w:r>
-      <w:proofErr w:type="gramStart"/>
-      <w:r>
-        <w:t>A},</w:t>
-      </w:r>
-      <w:proofErr w:type="gramEnd"/>
-      <w:r>
-        <w:t> ${option_</w:t>
-      </w:r>
-      <w:proofErr w:type="gramStart"/>
-      <w:r>
-        <w:t>B},</w:t>
-      </w:r>
-      <w:proofErr w:type="gramEnd"/>
-      <w:r>
-        <w:t> ${option_</w:t>
-      </w:r>
-      <w:proofErr w:type="gramStart"/>
-      <w:r>
-        <w:t>C},</w:t>
-      </w:r>
-      <w:proofErr w:type="gramEnd"/>
-      <w:r>
-        <w:t> ${option_</w:t>
-      </w:r>
-      <w:proofErr w:type="gramStart"/>
-      <w:r>
-        <w:t>D},</w:t>
-      </w:r>
-      <w:proofErr w:type="gramEnd"/>
-      <w:r>
-        <w:t> ${correct_</w:t>
-      </w:r>
-      <w:proofErr w:type="gramStart"/>
-      <w:r>
-        <w:t>answer},</w:t>
-      </w:r>
-      <w:proofErr w:type="gramEnd"/>
-      <w:r>
-        <w:t> ${level}</w:t>
+        <w:rPr>
+          <w:rFonts w:ascii="Times New Roman" w:eastAsia="Times New Roman" w:hAnsi="Times New Roman" w:cs="Times New Roman"/>
+          <w:b/>
+          <w:bCs/>
+        </w:rPr>
+        <w:t>)</w:t>
       </w:r>
     </w:p>
-    <w:p/>
+    <w:p>
+      <w:pPr>
+        <w:rPr>
+          <w:rFonts w:ascii="Times New Roman" w:eastAsia="Times New Roman" w:hAnsi="Times New Roman" w:cs="Times New Roman"/>
+          <w:b/>
+          <w:bCs/>
+          <w:lang w:val="it-IT"/>
+        </w:rPr>
+      </w:pPr>
+      <w:r>
+        <w:rPr>
+          <w:rFonts w:ascii="Times New Roman" w:eastAsia="Times New Roman" w:hAnsi="Times New Roman" w:cs="Times New Roman"/>
+          <w:b/>
+          <w:bCs/>
+          <w:lang w:val="it-IT"/>
+        </w:rPr>
+        <w:t>${questions_</w:t>
+      </w:r>
+      <w:r>
+        <w:rPr>
+          <w:rFonts w:ascii="Times New Roman" w:eastAsia="Times New Roman" w:hAnsi="Times New Roman" w:cs="Times New Roman"/>
+          <w:b/>
+          <w:bCs/>
+          <w:lang w:val="it-IT"/>
+        </w:rPr>
+        <w:t>tuluan</w:t>
+      </w:r>
+      <w:r>
+        <w:rPr>
+          <w:rFonts w:ascii="Times New Roman" w:eastAsia="Times New Roman" w:hAnsi="Times New Roman" w:cs="Times New Roman"/>
+          <w:b/>
+          <w:bCs/>
+          <w:lang w:val="it-IT"/>
+        </w:rPr>
+        <w:t>}</w:t>
+      </w:r>
+    </w:p>
+    <w:p>
+      <w:pPr>
+        <w:rPr>
+          <w:rFonts w:ascii="Times New Roman" w:eastAsia="Times New Roman" w:hAnsi="Times New Roman" w:cs="Times New Roman"/>
+          <w:b/>
+          <w:bCs/>
+        </w:rPr>
+      </w:pPr>
+      <w:r>
+        <w:rPr>
+          <w:rFonts w:ascii="Times New Roman" w:eastAsia="Times New Roman" w:hAnsi="Times New Roman" w:cs="Times New Roman"/>
+          <w:b/>
+          <w:bCs/>
+        </w:rPr>
+        <w:t>IV. THỰC HÀNH</w:t>
+      </w:r>
+    </w:p>
+    <w:p>
+      <w:pPr>
+        <w:rPr>
+          <w:rFonts w:ascii="Times New Roman" w:hAnsi="Times New Roman" w:cs="Times New Roman"/>
+        </w:rPr>
+      </w:pPr>
+    </w:p>
     <w:sectPr>
       <w:pgSz w:w="12240" w:h="15840"/>
       <w:pgMar w:top="1440" w:right="1440" w:bottom="1440" w:left="1440" w:header="720" w:footer="720" w:gutter="0"/>
@@ -778,7 +1944,7 @@
     <w:lsdException w:name="Table Web 2" w:semiHidden="1" w:unhideWhenUsed="1"/>
     <w:lsdException w:name="Table Web 3" w:semiHidden="1" w:unhideWhenUsed="1"/>
     <w:lsdException w:name="Balloon Text" w:semiHidden="1" w:unhideWhenUsed="1"/>
-    <w:lsdException w:name="Table Grid" w:uiPriority="39"/>
+    <w:lsdException w:name="Table Grid" w:uiPriority="0" w:qFormat="1"/>
     <w:lsdException w:name="Table Theme" w:semiHidden="1" w:unhideWhenUsed="1"/>
     <w:lsdException w:name="Placeholder Text" w:semiHidden="1"/>
     <w:lsdException w:name="No Spacing" w:uiPriority="1" w:qFormat="1"/>
@@ -1207,6 +2373,7 @@
   <w:style w:type="character" w:default="1" w:styleId="DefaultParagraphFont">
     <w:name w:val="Default Paragraph Font"/>
     <w:uiPriority w:val="1"/>
+    <w:semiHidden/>
     <w:unhideWhenUsed/>
   </w:style>
   <w:style w:type="table" w:default="1" w:styleId="TableNormal">
@@ -1522,8 +2689,9 @@
   </w:style>
   <w:style w:type="table" w:styleId="TableGrid">
     <w:name w:val="Table Grid"/>
+    <w:aliases w:val="tham khao"/>
     <w:basedOn w:val="TableNormal"/>
-    <w:uiPriority w:val="39"/>
+    <w:qFormat/>
     <w:rsid w:val="00F00ACB"/>
     <w:pPr>
       <w:spacing w:after="0" w:line="240" w:lineRule="auto"/>
@@ -1538,6 +2706,23 @@
         <w:insideV w:val="single" w:sz="4" w:space="0" w:color="auto"/>
       </w:tblBorders>
     </w:tblPr>
+  </w:style>
+  <w:style w:type="paragraph" w:customStyle="1" w:styleId="Normal0">
+    <w:name w:val="Normal_0"/>
+    <w:uiPriority w:val="99"/>
+    <w:semiHidden/>
+    <w:qFormat/>
+    <w:rsid w:val="002D55BE"/>
+    <w:pPr>
+      <w:widowControl w:val="0"/>
+      <w:spacing w:after="0" w:line="240" w:lineRule="auto"/>
+    </w:pPr>
+    <w:rPr>
+      <w:rFonts w:ascii="Times New Roman" w:eastAsia="Times New Roman" w:hAnsi="Times New Roman" w:cs="Times New Roman"/>
+      <w:kern w:val="0"/>
+      <w:lang w:eastAsia="ja-JP"/>
+      <w14:ligatures w14:val="none"/>
+    </w:rPr>
   </w:style>
 </w:styles>
 </file>

</xml_diff>